<commit_message>
Small update in answer document
</commit_message>
<xml_diff>
--- a/Step-5/Actual_ET_5-answer-sheet.docx
+++ b/Step-5/Actual_ET_5-answer-sheet.docx
@@ -1,6 +1,6 @@
 
 <file path=word/document.xml><?xml version="1.0" encoding="utf-8"?>
-<w:document xmlns:wpc="http://schemas.microsoft.com/office/word/2010/wordprocessingCanvas" xmlns:cx="http://schemas.microsoft.com/office/drawing/2014/chartex" xmlns:cx1="http://schemas.microsoft.com/office/drawing/2015/9/8/chartex" xmlns:cx2="http://schemas.microsoft.com/office/drawing/2015/10/21/chartex" xmlns:cx3="http://schemas.microsoft.com/office/drawing/2016/5/9/chartex" xmlns:cx4="http://schemas.microsoft.com/office/drawing/2016/5/10/chartex" xmlns:cx5="http://schemas.microsoft.com/office/drawing/2016/5/11/chartex" xmlns:cx6="http://schemas.microsoft.com/office/drawing/2016/5/12/chartex" xmlns:cx7="http://schemas.microsoft.com/office/drawing/2016/5/13/chartex" xmlns:cx8="http://schemas.microsoft.com/office/drawing/2016/5/14/chartex" xmlns:mc="http://schemas.openxmlformats.org/markup-compatibility/2006" xmlns:aink="http://schemas.microsoft.com/office/drawing/2016/ink" xmlns:am3d="http://schemas.microsoft.com/office/drawing/2017/model3d" xmlns:o="urn:schemas-microsoft-com:office:office" xmlns:oel="http://schemas.microsoft.com/office/2019/extlst" xmlns:r="http://schemas.openxmlformats.org/officeDocument/2006/relationships" xmlns:m="http://schemas.openxmlformats.org/officeDocument/2006/math" xmlns:v="urn:schemas-microsoft-com:vml" xmlns:wp14="http://schemas.microsoft.com/office/word/2010/wordprocessingDrawing" xmlns:wp="http://schemas.openxmlformats.org/drawingml/2006/wordprocessingDrawing" xmlns:w10="urn:schemas-microsoft-com:office:word" xmlns:w="http://schemas.openxmlformats.org/wordprocessingml/2006/main" xmlns:w14="http://schemas.microsoft.com/office/word/2010/wordml" xmlns:w15="http://schemas.microsoft.com/office/word/2012/wordml" xmlns:w16cex="http://schemas.microsoft.com/office/word/2018/wordml/cex" xmlns:w16cid="http://schemas.microsoft.com/office/word/2016/wordml/cid" xmlns:w16="http://schemas.microsoft.com/office/word/2018/wordml" xmlns:w16sdtdh="http://schemas.microsoft.com/office/word/2020/wordml/sdtdatahash" xmlns:w16se="http://schemas.microsoft.com/office/word/2015/wordml/symex" xmlns:wpg="http://schemas.microsoft.com/office/word/2010/wordprocessingGroup" xmlns:wpi="http://schemas.microsoft.com/office/word/2010/wordprocessingInk" xmlns:wne="http://schemas.microsoft.com/office/word/2006/wordml" xmlns:wps="http://schemas.microsoft.com/office/word/2010/wordprocessingShape" mc:Ignorable="w14 w15 w16se w16cid w16 w16cex w16sdtdh wp14">
+<w:document xmlns:wpc="http://schemas.microsoft.com/office/word/2010/wordprocessingCanvas" xmlns:cx="http://schemas.microsoft.com/office/drawing/2014/chartex" xmlns:cx1="http://schemas.microsoft.com/office/drawing/2015/9/8/chartex" xmlns:cx2="http://schemas.microsoft.com/office/drawing/2015/10/21/chartex" xmlns:cx3="http://schemas.microsoft.com/office/drawing/2016/5/9/chartex" xmlns:cx4="http://schemas.microsoft.com/office/drawing/2016/5/10/chartex" xmlns:cx5="http://schemas.microsoft.com/office/drawing/2016/5/11/chartex" xmlns:cx6="http://schemas.microsoft.com/office/drawing/2016/5/12/chartex" xmlns:cx7="http://schemas.microsoft.com/office/drawing/2016/5/13/chartex" xmlns:cx8="http://schemas.microsoft.com/office/drawing/2016/5/14/chartex" xmlns:mc="http://schemas.openxmlformats.org/markup-compatibility/2006" xmlns:aink="http://schemas.microsoft.com/office/drawing/2016/ink" xmlns:am3d="http://schemas.microsoft.com/office/drawing/2017/model3d" xmlns:o="urn:schemas-microsoft-com:office:office" xmlns:oel="http://schemas.microsoft.com/office/2019/extlst" xmlns:r="http://schemas.openxmlformats.org/officeDocument/2006/relationships" xmlns:m="http://schemas.openxmlformats.org/officeDocument/2006/math" xmlns:v="urn:schemas-microsoft-com:vml" xmlns:wp14="http://schemas.microsoft.com/office/word/2010/wordprocessingDrawing" xmlns:wp="http://schemas.openxmlformats.org/drawingml/2006/wordprocessingDrawing" xmlns:w10="urn:schemas-microsoft-com:office:word" xmlns:w="http://schemas.openxmlformats.org/wordprocessingml/2006/main" xmlns:w14="http://schemas.microsoft.com/office/word/2010/wordml" xmlns:w15="http://schemas.microsoft.com/office/word/2012/wordml" xmlns:w16cex="http://schemas.microsoft.com/office/word/2018/wordml/cex" xmlns:w16cid="http://schemas.microsoft.com/office/word/2016/wordml/cid" xmlns:w16="http://schemas.microsoft.com/office/word/2018/wordml" xmlns:w16du="http://schemas.microsoft.com/office/word/2023/wordml/word16du" xmlns:w16sdtdh="http://schemas.microsoft.com/office/word/2020/wordml/sdtdatahash" xmlns:w16sdtfl="http://schemas.microsoft.com/office/word/2024/wordml/sdtformatlock" xmlns:w16se="http://schemas.microsoft.com/office/word/2015/wordml/symex" xmlns:wpg="http://schemas.microsoft.com/office/word/2010/wordprocessingGroup" xmlns:wpi="http://schemas.microsoft.com/office/word/2010/wordprocessingInk" xmlns:wne="http://schemas.microsoft.com/office/word/2006/wordml" xmlns:wps="http://schemas.microsoft.com/office/word/2010/wordprocessingShape" mc:Ignorable="w14 w15 w16se w16cid w16 w16cex w16sdtdh w16sdtfl w16du wp14">
   <w:body>
     <w:p>
       <w:pPr>
@@ -9,29 +9,12 @@
           <w:sz w:val="32"/>
         </w:rPr>
       </w:pPr>
-      <w:proofErr w:type="gramStart"/>
       <w:r>
         <w:rPr>
           <w:b/>
           <w:sz w:val="32"/>
         </w:rPr>
-        <w:t>Additional</w:t>
-      </w:r>
-      <w:proofErr w:type="gramEnd"/>
-      <w:r>
-        <w:rPr>
-          <w:b/>
-          <w:sz w:val="32"/>
-        </w:rPr>
-        <w:t xml:space="preserve"> methods for </w:t>
-      </w:r>
-      <w:proofErr w:type="spellStart"/>
-      <w:r>
-        <w:rPr>
-          <w:b/>
-          <w:sz w:val="32"/>
-        </w:rPr>
-        <w:t>ET</w:t>
+        <w:t>Additional methods for ET</w:t>
       </w:r>
       <w:r>
         <w:rPr>
@@ -41,7 +24,6 @@
         </w:rPr>
         <w:t>ref</w:t>
       </w:r>
-      <w:proofErr w:type="spellEnd"/>
       <w:r>
         <w:rPr>
           <w:b/>
@@ -116,16 +98,11 @@
             <w:tcW w:w="2613" w:type="dxa"/>
           </w:tcPr>
           <w:p>
-            <w:proofErr w:type="gramStart"/>
             <w:r>
               <w:t xml:space="preserve">Student </w:t>
             </w:r>
             <w:r>
-              <w:t xml:space="preserve"> (</w:t>
-            </w:r>
-            <w:proofErr w:type="gramEnd"/>
-            <w:r>
-              <w:t>name)</w:t>
+              <w:t xml:space="preserve"> (name)</w:t>
             </w:r>
           </w:p>
         </w:tc>
@@ -186,23 +163,7 @@
     </w:p>
     <w:p>
       <w:r>
-        <w:t xml:space="preserve">The main work needs to </w:t>
-      </w:r>
-      <w:proofErr w:type="gramStart"/>
-      <w:r>
-        <w:t>be done</w:t>
-      </w:r>
-      <w:proofErr w:type="gramEnd"/>
-      <w:r>
-        <w:t xml:space="preserve"> in the notebook. In the table below you can briefly document your progress (did it work at once, or after </w:t>
-      </w:r>
-      <w:proofErr w:type="gramStart"/>
-      <w:r>
-        <w:t>some</w:t>
-      </w:r>
-      <w:proofErr w:type="gramEnd"/>
-      <w:r>
-        <w:t xml:space="preserve"> iterations, what were the hurdles)</w:t>
+        <w:t>The main work needs to be done in the notebook. In the table below you can briefly document your progress (did it work at once, or after some iterations, what were the hurdles)</w:t>
       </w:r>
     </w:p>
     <w:tbl>
@@ -302,21 +263,7 @@
               <w:rPr>
                 <w:b/>
               </w:rPr>
-              <w:t xml:space="preserve">OK </w:t>
-            </w:r>
-            <w:proofErr w:type="gramStart"/>
-            <w:r>
-              <w:rPr>
-                <w:b/>
-              </w:rPr>
-              <w:t>some</w:t>
-            </w:r>
-            <w:proofErr w:type="gramEnd"/>
-            <w:r>
-              <w:rPr>
-                <w:b/>
-              </w:rPr>
-              <w:t xml:space="preserve"> tries</w:t>
+              <w:t>OK some tries</w:t>
             </w:r>
           </w:p>
         </w:tc>
@@ -348,24 +295,14 @@
             <w:permStart w:id="321587564" w:edGrp="everyone" w:colFirst="1" w:colLast="1"/>
             <w:permStart w:id="1319502479" w:edGrp="everyone" w:colFirst="2" w:colLast="2"/>
             <w:permStart w:id="895251871" w:edGrp="everyone" w:colFirst="3" w:colLast="3"/>
-            <w:proofErr w:type="spellStart"/>
-            <w:r>
-              <w:t>f_</w:t>
-            </w:r>
-            <w:proofErr w:type="gramStart"/>
-            <w:r>
-              <w:t>P</w:t>
+            <w:r>
+              <w:t>f_P</w:t>
             </w:r>
             <w:r>
               <w:t>T</w:t>
             </w:r>
-            <w:proofErr w:type="spellEnd"/>
-            <w:r>
-              <w:t>(</w:t>
-            </w:r>
-            <w:proofErr w:type="gramEnd"/>
-            <w:r>
-              <w:t>....)</w:t>
+            <w:r>
+              <w:t>(....)</w:t>
             </w:r>
           </w:p>
         </w:tc>
@@ -400,13 +337,8 @@
             <w:permEnd w:id="321587564"/>
             <w:permEnd w:id="1319502479"/>
             <w:permEnd w:id="895251871"/>
-            <w:proofErr w:type="spellStart"/>
-            <w:r>
-              <w:t>f_ra</w:t>
-            </w:r>
-            <w:proofErr w:type="spellEnd"/>
-            <w:r>
-              <w:t>(...)</w:t>
+            <w:r>
+              <w:t>f_ra(...)</w:t>
             </w:r>
           </w:p>
         </w:tc>
@@ -441,13 +373,8 @@
             <w:permEnd w:id="213795961"/>
             <w:permEnd w:id="1489506637"/>
             <w:permEnd w:id="386213937"/>
-            <w:proofErr w:type="spellStart"/>
-            <w:r>
-              <w:t>f_PM</w:t>
-            </w:r>
-            <w:proofErr w:type="spellEnd"/>
-            <w:r>
-              <w:t>(...)</w:t>
+            <w:r>
+              <w:t>f_PM(...)</w:t>
             </w:r>
           </w:p>
         </w:tc>
@@ -489,7 +416,16 @@
       </w:r>
       <w:proofErr w:type="spellStart"/>
       <w:r>
-        <w:t>ET</w:t>
+        <w:t>L</w:t>
+      </w:r>
+      <w:r>
+        <w:rPr>
+          <w:vertAlign w:val="subscript"/>
+        </w:rPr>
+        <w:t>v</w:t>
+      </w:r>
+      <w:r>
+        <w:t>E</w:t>
       </w:r>
       <w:r>
         <w:rPr>
@@ -510,15 +446,38 @@
     </w:p>
     <w:p>
       <w:r>
-        <w:t xml:space="preserve">Include your values below and/or include a graph that shows the time series of reference ET with the three methods (include them in one plot, and please give the series a name so that it is clear which line </w:t>
-      </w:r>
-      <w:proofErr w:type="gramStart"/>
-      <w:r>
-        <w:t>represents</w:t>
-      </w:r>
-      <w:proofErr w:type="gramEnd"/>
-      <w:r>
-        <w:t xml:space="preserve"> which method).</w:t>
+        <w:t xml:space="preserve">Include your values below and/or include a graph that shows the time series of reference </w:t>
+      </w:r>
+      <w:proofErr w:type="spellStart"/>
+      <w:r>
+        <w:t>L</w:t>
+      </w:r>
+      <w:r>
+        <w:rPr>
+          <w:vertAlign w:val="subscript"/>
+        </w:rPr>
+        <w:t>v</w:t>
+      </w:r>
+      <w:r>
+        <w:t>E</w:t>
+      </w:r>
+      <w:proofErr w:type="spellEnd"/>
+      <w:r>
+        <w:t xml:space="preserve"> with the three methods (include them in one plot, and please give the series a name so that it is clear which line represents which method).</w:t>
+      </w:r>
+      <w:r>
+        <w:t xml:space="preserve"> </w:t>
+      </w:r>
+    </w:p>
+    <w:p>
+      <w:r>
+        <w:t>Note</w:t>
+      </w:r>
+      <w:r>
+        <w:t xml:space="preserve"> that </w:t>
+      </w:r>
+      <w:r>
+        <w:t>you can work with energy fluxes here, not need to convert to mm/day.</w:t>
       </w:r>
     </w:p>
     <w:tbl>
@@ -569,7 +528,6 @@
         <w:ind w:hanging="720"/>
       </w:pPr>
       <w:r>
-        <w:lastRenderedPageBreak/>
         <w:t>Explore the different methods (201</w:t>
       </w:r>
       <w:r>
@@ -590,34 +548,26 @@
         <w:gridCol w:w="6327"/>
       </w:tblGrid>
       <w:tr>
+        <w:trPr>
+          <w:trHeight w:val="230"/>
+        </w:trPr>
         <w:tc>
           <w:tcPr>
             <w:tcW w:w="2689" w:type="dxa"/>
-          </w:tcPr>
-          <w:p>
-            <w:permStart w:id="212599641" w:edGrp="everyone" w:colFirst="1" w:colLast="1"/>
-            <w:r>
-              <w:t>How do each of the methods vary, and can you link those variations to the</w:t>
-            </w:r>
-            <w:r>
-              <w:t xml:space="preserve"> </w:t>
-            </w:r>
-            <w:r>
-              <w:t>meteorological conditions</w:t>
+            <w:vMerge w:val="restart"/>
+          </w:tcPr>
+          <w:p>
+            <w:r>
+              <w:t>How do each of the methods vary, and can you link those variations to the meteorological conditions</w:t>
             </w:r>
             <w:r>
               <w:t>.</w:t>
             </w:r>
           </w:p>
-          <w:p>
-            <w:r>
-              <w:t xml:space="preserve">Include </w:t>
-            </w:r>
-            <w:r>
-              <w:t>graphs to illustrate your point.</w:t>
-            </w:r>
-            <w:r>
-              <w:t xml:space="preserve"> </w:t>
+          <w:p/>
+          <w:p>
+            <w:r>
+              <w:t xml:space="preserve">Include graphs to illustrate your point. </w:t>
             </w:r>
           </w:p>
           <w:p/>
@@ -626,20 +576,138 @@
           <w:tcPr>
             <w:tcW w:w="6327" w:type="dxa"/>
           </w:tcPr>
-          <w:p/>
-          <w:p/>
-          <w:p/>
-          <w:p/>
+          <w:p>
+            <w:proofErr w:type="spellStart"/>
+            <w:r>
+              <w:t>Makkink</w:t>
+            </w:r>
+            <w:proofErr w:type="spellEnd"/>
+          </w:p>
         </w:tc>
       </w:tr>
       <w:tr>
+        <w:trPr>
+          <w:trHeight w:val="227"/>
+        </w:trPr>
         <w:tc>
           <w:tcPr>
             <w:tcW w:w="2689" w:type="dxa"/>
+            <w:vMerge/>
+          </w:tcPr>
+          <w:p>
+            <w:permStart w:id="2023908478" w:edGrp="everyone" w:colFirst="1" w:colLast="1"/>
+          </w:p>
+        </w:tc>
+        <w:tc>
+          <w:tcPr>
+            <w:tcW w:w="6327" w:type="dxa"/>
+          </w:tcPr>
+          <w:p/>
+          <w:p/>
+          <w:p/>
+          <w:p/>
+        </w:tc>
+      </w:tr>
+      <w:permEnd w:id="2023908478"/>
+      <w:tr>
+        <w:trPr>
+          <w:trHeight w:val="227"/>
+        </w:trPr>
+        <w:tc>
+          <w:tcPr>
+            <w:tcW w:w="2689" w:type="dxa"/>
+            <w:vMerge/>
+          </w:tcPr>
+          <w:p/>
+        </w:tc>
+        <w:tc>
+          <w:tcPr>
+            <w:tcW w:w="6327" w:type="dxa"/>
+          </w:tcPr>
+          <w:p>
+            <w:r>
+              <w:t>Priestley-Taylor</w:t>
+            </w:r>
+          </w:p>
+        </w:tc>
+      </w:tr>
+      <w:tr>
+        <w:trPr>
+          <w:trHeight w:val="227"/>
+        </w:trPr>
+        <w:tc>
+          <w:tcPr>
+            <w:tcW w:w="2689" w:type="dxa"/>
+            <w:vMerge/>
+          </w:tcPr>
+          <w:p>
+            <w:permStart w:id="1006064683" w:edGrp="everyone" w:colFirst="1" w:colLast="1"/>
+          </w:p>
+        </w:tc>
+        <w:tc>
+          <w:tcPr>
+            <w:tcW w:w="6327" w:type="dxa"/>
+          </w:tcPr>
+          <w:p/>
+          <w:p/>
+          <w:p/>
+          <w:p/>
+        </w:tc>
+      </w:tr>
+      <w:permEnd w:id="1006064683"/>
+      <w:tr>
+        <w:trPr>
+          <w:trHeight w:val="227"/>
+        </w:trPr>
+        <w:tc>
+          <w:tcPr>
+            <w:tcW w:w="2689" w:type="dxa"/>
+            <w:vMerge/>
+          </w:tcPr>
+          <w:p/>
+        </w:tc>
+        <w:tc>
+          <w:tcPr>
+            <w:tcW w:w="6327" w:type="dxa"/>
+          </w:tcPr>
+          <w:p>
+            <w:r>
+              <w:t>Penman-Monteith</w:t>
+            </w:r>
+          </w:p>
+        </w:tc>
+      </w:tr>
+      <w:tr>
+        <w:trPr>
+          <w:trHeight w:val="227"/>
+        </w:trPr>
+        <w:tc>
+          <w:tcPr>
+            <w:tcW w:w="2689" w:type="dxa"/>
+            <w:vMerge/>
+          </w:tcPr>
+          <w:p>
+            <w:permStart w:id="118497381" w:edGrp="everyone" w:colFirst="1" w:colLast="1"/>
+          </w:p>
+        </w:tc>
+        <w:tc>
+          <w:tcPr>
+            <w:tcW w:w="6327" w:type="dxa"/>
+          </w:tcPr>
+          <w:p/>
+          <w:p/>
+          <w:p/>
+          <w:p/>
+        </w:tc>
+      </w:tr>
+      <w:tr>
+        <w:tc>
+          <w:tcPr>
+            <w:tcW w:w="2689" w:type="dxa"/>
           </w:tcPr>
           <w:p>
             <w:permStart w:id="1315984287" w:edGrp="everyone" w:colFirst="1" w:colLast="1"/>
-            <w:permEnd w:id="212599641"/>
+            <w:permEnd w:id="118497381"/>
             <w:r>
               <w:t>How do the three methods differ (in which direction, at which moments) and which properties of the different methods could explain those difference?</w:t>
             </w:r>
@@ -671,7 +739,24 @@
         <w:ind w:hanging="720"/>
       </w:pPr>
       <w:r>
-        <w:t xml:space="preserve">Compare the different methods to actual ET of grass </w:t>
+        <w:t xml:space="preserve">Compare the different methods to actual </w:t>
+      </w:r>
+      <w:proofErr w:type="spellStart"/>
+      <w:r>
+        <w:t>L</w:t>
+      </w:r>
+      <w:r>
+        <w:rPr>
+          <w:vertAlign w:val="subscript"/>
+        </w:rPr>
+        <w:t>v</w:t>
+      </w:r>
+      <w:r>
+        <w:t>E</w:t>
+      </w:r>
+      <w:proofErr w:type="spellEnd"/>
+      <w:r>
+        <w:t xml:space="preserve"> of grass </w:t>
       </w:r>
       <w:r>
         <w:br/>
@@ -705,8 +790,22 @@
             </w:pPr>
             <w:permStart w:id="1133731007" w:edGrp="everyone" w:colFirst="1" w:colLast="1"/>
             <w:r>
-              <w:t>Are the results of Priestley-Taylor or Penman-Monteith closer to the actual ET</w:t>
-            </w:r>
+              <w:t xml:space="preserve">Are the results of Priestley-Taylor or Penman-Monteith closer to the actual </w:t>
+            </w:r>
+            <w:proofErr w:type="spellStart"/>
+            <w:r>
+              <w:t>L</w:t>
+            </w:r>
+            <w:r>
+              <w:rPr>
+                <w:vertAlign w:val="subscript"/>
+              </w:rPr>
+              <w:t>v</w:t>
+            </w:r>
+            <w:r>
+              <w:t>E</w:t>
+            </w:r>
+            <w:proofErr w:type="spellEnd"/>
             <w:r>
               <w:t xml:space="preserve"> than </w:t>
             </w:r>
@@ -739,7 +838,13 @@
             <w:permStart w:id="661597077" w:edGrp="everyone" w:colFirst="1" w:colLast="1"/>
             <w:permEnd w:id="1133731007"/>
             <w:r>
-              <w:t>On which moments?</w:t>
+              <w:t xml:space="preserve">On which </w:t>
+            </w:r>
+            <w:r>
+              <w:t>days</w:t>
+            </w:r>
+            <w:r>
+              <w:t>?</w:t>
             </w:r>
           </w:p>
           <w:p>
@@ -772,6 +877,11 @@
             <w:r>
               <w:t>What could be the explanation?</w:t>
             </w:r>
+          </w:p>
+          <w:p>
+            <w:pPr>
+              <w:spacing w:after="200" w:line="302" w:lineRule="auto"/>
+            </w:pPr>
           </w:p>
         </w:tc>
         <w:tc>
@@ -794,22 +904,32 @@
         <w:ind w:hanging="720"/>
       </w:pPr>
       <w:r>
-        <w:t xml:space="preserve">Compare the different methods to actual ET of grass </w:t>
+        <w:lastRenderedPageBreak/>
+        <w:t xml:space="preserve">Compare the different methods to actual </w:t>
+      </w:r>
+      <w:proofErr w:type="spellStart"/>
+      <w:r>
+        <w:t>L</w:t>
+      </w:r>
+      <w:r>
+        <w:rPr>
+          <w:vertAlign w:val="subscript"/>
+        </w:rPr>
+        <w:t>v</w:t>
+      </w:r>
+      <w:r>
+        <w:t>E</w:t>
+      </w:r>
+      <w:proofErr w:type="spellEnd"/>
+      <w:r>
+        <w:t xml:space="preserve"> of grass </w:t>
       </w:r>
       <w:r>
         <w:br/>
         <w:t>(2011 data</w:t>
       </w:r>
       <w:r>
-        <w:t xml:space="preserve">: </w:t>
-      </w:r>
-      <w:proofErr w:type="gramStart"/>
-      <w:r>
-        <w:t>30 minute</w:t>
-      </w:r>
-      <w:proofErr w:type="gramEnd"/>
-      <w:r>
-        <w:t xml:space="preserve"> average fluxes</w:t>
+        <w:t>: 30 minute average fluxes</w:t>
       </w:r>
       <w:r>
         <w:t>)</w:t>
@@ -859,7 +979,16 @@
             <w:permStart w:id="2073109345" w:edGrp="everyone" w:colFirst="1" w:colLast="1"/>
             <w:permEnd w:id="965353381"/>
             <w:r>
-              <w:t>On which moments?</w:t>
+              <w:t>On which moments</w:t>
+            </w:r>
+            <w:r>
+              <w:t xml:space="preserve"> do they differ</w:t>
+            </w:r>
+            <w:r>
+              <w:t>, and how</w:t>
+            </w:r>
+            <w:r>
+              <w:t>?</w:t>
             </w:r>
           </w:p>
           <w:p>
@@ -867,7 +996,6 @@
               <w:spacing w:after="200" w:line="302" w:lineRule="auto"/>
             </w:pPr>
             <w:r>
-              <w:lastRenderedPageBreak/>
               <w:t>Include graphs to illustrate your point.</w:t>
             </w:r>
           </w:p>
@@ -950,10 +1078,7 @@
             </w:pPr>
             <w:permStart w:id="1381112745" w:edGrp="everyone" w:colFirst="1" w:colLast="1"/>
             <w:r>
-              <w:t xml:space="preserve">How do </w:t>
-            </w:r>
-            <w:r>
-              <w:t>the Penman-Monteith fluxes with the two averaging methods compare?</w:t>
+              <w:t>How do the Penman-Monteith fluxes with the two averaging methods compare?</w:t>
             </w:r>
           </w:p>
         </w:tc>
@@ -1032,7 +1157,7 @@
 </file>
 
 <file path=word/numbering.xml><?xml version="1.0" encoding="utf-8"?>
-<w:numbering xmlns:wpc="http://schemas.microsoft.com/office/word/2010/wordprocessingCanvas" xmlns:cx="http://schemas.microsoft.com/office/drawing/2014/chartex" xmlns:cx1="http://schemas.microsoft.com/office/drawing/2015/9/8/chartex" xmlns:cx2="http://schemas.microsoft.com/office/drawing/2015/10/21/chartex" xmlns:cx3="http://schemas.microsoft.com/office/drawing/2016/5/9/chartex" xmlns:cx4="http://schemas.microsoft.com/office/drawing/2016/5/10/chartex" xmlns:cx5="http://schemas.microsoft.com/office/drawing/2016/5/11/chartex" xmlns:cx6="http://schemas.microsoft.com/office/drawing/2016/5/12/chartex" xmlns:cx7="http://schemas.microsoft.com/office/drawing/2016/5/13/chartex" xmlns:cx8="http://schemas.microsoft.com/office/drawing/2016/5/14/chartex" xmlns:mc="http://schemas.openxmlformats.org/markup-compatibility/2006" xmlns:aink="http://schemas.microsoft.com/office/drawing/2016/ink" xmlns:am3d="http://schemas.microsoft.com/office/drawing/2017/model3d" xmlns:o="urn:schemas-microsoft-com:office:office" xmlns:oel="http://schemas.microsoft.com/office/2019/extlst" xmlns:r="http://schemas.openxmlformats.org/officeDocument/2006/relationships" xmlns:m="http://schemas.openxmlformats.org/officeDocument/2006/math" xmlns:v="urn:schemas-microsoft-com:vml" xmlns:wp14="http://schemas.microsoft.com/office/word/2010/wordprocessingDrawing" xmlns:wp="http://schemas.openxmlformats.org/drawingml/2006/wordprocessingDrawing" xmlns:w10="urn:schemas-microsoft-com:office:word" xmlns:w="http://schemas.openxmlformats.org/wordprocessingml/2006/main" xmlns:w14="http://schemas.microsoft.com/office/word/2010/wordml" xmlns:w15="http://schemas.microsoft.com/office/word/2012/wordml" xmlns:w16cex="http://schemas.microsoft.com/office/word/2018/wordml/cex" xmlns:w16cid="http://schemas.microsoft.com/office/word/2016/wordml/cid" xmlns:w16="http://schemas.microsoft.com/office/word/2018/wordml" xmlns:w16sdtdh="http://schemas.microsoft.com/office/word/2020/wordml/sdtdatahash" xmlns:w16se="http://schemas.microsoft.com/office/word/2015/wordml/symex" xmlns:wpg="http://schemas.microsoft.com/office/word/2010/wordprocessingGroup" xmlns:wpi="http://schemas.microsoft.com/office/word/2010/wordprocessingInk" xmlns:wne="http://schemas.microsoft.com/office/word/2006/wordml" xmlns:wps="http://schemas.microsoft.com/office/word/2010/wordprocessingShape" mc:Ignorable="w14 w15 w16se w16cid w16 w16cex w16sdtdh wp14">
+<w:numbering xmlns:wpc="http://schemas.microsoft.com/office/word/2010/wordprocessingCanvas" xmlns:cx="http://schemas.microsoft.com/office/drawing/2014/chartex" xmlns:cx1="http://schemas.microsoft.com/office/drawing/2015/9/8/chartex" xmlns:cx2="http://schemas.microsoft.com/office/drawing/2015/10/21/chartex" xmlns:cx3="http://schemas.microsoft.com/office/drawing/2016/5/9/chartex" xmlns:cx4="http://schemas.microsoft.com/office/drawing/2016/5/10/chartex" xmlns:cx5="http://schemas.microsoft.com/office/drawing/2016/5/11/chartex" xmlns:cx6="http://schemas.microsoft.com/office/drawing/2016/5/12/chartex" xmlns:cx7="http://schemas.microsoft.com/office/drawing/2016/5/13/chartex" xmlns:cx8="http://schemas.microsoft.com/office/drawing/2016/5/14/chartex" xmlns:mc="http://schemas.openxmlformats.org/markup-compatibility/2006" xmlns:aink="http://schemas.microsoft.com/office/drawing/2016/ink" xmlns:am3d="http://schemas.microsoft.com/office/drawing/2017/model3d" xmlns:o="urn:schemas-microsoft-com:office:office" xmlns:oel="http://schemas.microsoft.com/office/2019/extlst" xmlns:r="http://schemas.openxmlformats.org/officeDocument/2006/relationships" xmlns:m="http://schemas.openxmlformats.org/officeDocument/2006/math" xmlns:v="urn:schemas-microsoft-com:vml" xmlns:wp14="http://schemas.microsoft.com/office/word/2010/wordprocessingDrawing" xmlns:wp="http://schemas.openxmlformats.org/drawingml/2006/wordprocessingDrawing" xmlns:w10="urn:schemas-microsoft-com:office:word" xmlns:w="http://schemas.openxmlformats.org/wordprocessingml/2006/main" xmlns:w14="http://schemas.microsoft.com/office/word/2010/wordml" xmlns:w15="http://schemas.microsoft.com/office/word/2012/wordml" xmlns:w16cex="http://schemas.microsoft.com/office/word/2018/wordml/cex" xmlns:w16cid="http://schemas.microsoft.com/office/word/2016/wordml/cid" xmlns:w16="http://schemas.microsoft.com/office/word/2018/wordml" xmlns:w16du="http://schemas.microsoft.com/office/word/2023/wordml/word16du" xmlns:w16sdtdh="http://schemas.microsoft.com/office/word/2020/wordml/sdtdatahash" xmlns:w16sdtfl="http://schemas.microsoft.com/office/word/2024/wordml/sdtformatlock" xmlns:w16se="http://schemas.microsoft.com/office/word/2015/wordml/symex" xmlns:wpg="http://schemas.microsoft.com/office/word/2010/wordprocessingGroup" xmlns:wpi="http://schemas.microsoft.com/office/word/2010/wordprocessingInk" xmlns:wne="http://schemas.microsoft.com/office/word/2006/wordml" xmlns:wps="http://schemas.microsoft.com/office/word/2010/wordprocessingShape" mc:Ignorable="w14 w15 w16se w16cid w16 w16cex w16sdtdh w16sdtfl w16du wp14">
   <w:abstractNum w:abstractNumId="0" w15:restartNumberingAfterBreak="0">
     <w:nsid w:val="0B9C0586"/>
     <w:multiLevelType w:val="hybridMultilevel"/>
@@ -1525,7 +1650,7 @@
 </file>
 
 <file path=word/styles.xml><?xml version="1.0" encoding="utf-8"?>
-<w:styles xmlns:mc="http://schemas.openxmlformats.org/markup-compatibility/2006" xmlns:r="http://schemas.openxmlformats.org/officeDocument/2006/relationships" xmlns:w="http://schemas.openxmlformats.org/wordprocessingml/2006/main" xmlns:w14="http://schemas.microsoft.com/office/word/2010/wordml" xmlns:w15="http://schemas.microsoft.com/office/word/2012/wordml" xmlns:w16cex="http://schemas.microsoft.com/office/word/2018/wordml/cex" xmlns:w16cid="http://schemas.microsoft.com/office/word/2016/wordml/cid" xmlns:w16="http://schemas.microsoft.com/office/word/2018/wordml" xmlns:w16sdtdh="http://schemas.microsoft.com/office/word/2020/wordml/sdtdatahash" xmlns:w16se="http://schemas.microsoft.com/office/word/2015/wordml/symex" mc:Ignorable="w14 w15 w16se w16cid w16 w16cex w16sdtdh">
+<w:styles xmlns:mc="http://schemas.openxmlformats.org/markup-compatibility/2006" xmlns:r="http://schemas.openxmlformats.org/officeDocument/2006/relationships" xmlns:w="http://schemas.openxmlformats.org/wordprocessingml/2006/main" xmlns:w14="http://schemas.microsoft.com/office/word/2010/wordml" xmlns:w15="http://schemas.microsoft.com/office/word/2012/wordml" xmlns:w16cex="http://schemas.microsoft.com/office/word/2018/wordml/cex" xmlns:w16cid="http://schemas.microsoft.com/office/word/2016/wordml/cid" xmlns:w16="http://schemas.microsoft.com/office/word/2018/wordml" xmlns:w16du="http://schemas.microsoft.com/office/word/2023/wordml/word16du" xmlns:w16sdtdh="http://schemas.microsoft.com/office/word/2020/wordml/sdtdatahash" xmlns:w16sdtfl="http://schemas.microsoft.com/office/word/2024/wordml/sdtformatlock" xmlns:w16se="http://schemas.microsoft.com/office/word/2015/wordml/symex" mc:Ignorable="w14 w15 w16se w16cid w16 w16cex w16sdtdh w16sdtfl w16du">
   <w:docDefaults>
     <w:rPrDefault>
       <w:rPr>

</xml_diff>